<commit_message>
Fix: usar hora local flotante en DTSTART/DTEND de vuelos (evita desfase por UTC) + detectar cruce medianoche
</commit_message>
<xml_diff>
--- a/Instalación Web App Flightlog.docx
+++ b/Instalación Web App Flightlog.docx
@@ -120,34 +120,7 @@
           <w:szCs w:val="44"/>
           <w:lang w:val="es-AR"/>
         </w:rPr>
-        <w:t>Instalación</w:t>
-      </w:r>
-      <w:r>
-        <w:rPr>
-          <w:rFonts w:ascii="Bahnschrift" w:hAnsi="Bahnschrift"/>
-          <w:sz w:val="44"/>
-          <w:szCs w:val="44"/>
-          <w:lang w:val="es-AR"/>
-        </w:rPr>
-        <w:t xml:space="preserve"> Web App </w:t>
-      </w:r>
-      <w:r>
-        <w:rPr>
-          <w:rFonts w:ascii="Bahnschrift" w:hAnsi="Bahnschrift"/>
-          <w:sz w:val="44"/>
-          <w:szCs w:val="44"/>
-          <w:lang w:val="es-AR"/>
-        </w:rPr>
-        <w:t>Flightlog</w:t>
-      </w:r>
-      <w:r>
-        <w:rPr>
-          <w:rFonts w:ascii="Bahnschrift" w:hAnsi="Bahnschrift"/>
-          <w:sz w:val="44"/>
-          <w:szCs w:val="44"/>
-          <w:lang w:val="es-AR"/>
-        </w:rPr>
-        <w:t>.</w:t>
+        <w:t>Instalación Web App Flightlog.</w:t>
       </w:r>
     </w:p>
     <w:p>
@@ -216,27 +189,6 @@
         </w:rPr>
         <w:t>Ingresa a la página web de la aplicación que deseas instalar</w:t>
       </w:r>
-      <w:r>
-        <w:rPr>
-          <w:lang w:val="es-AR"/>
-        </w:rPr>
-        <w:t xml:space="preserve"> </w:t>
-      </w:r>
-      <w:hyperlink r:id="rId6" w:history="1">
-        <w:r>
-          <w:rPr>
-            <w:rStyle w:val="Hipervnculo"/>
-            <w:lang w:val="es-AR"/>
-          </w:rPr>
-          <w:t>accediendo aqui</w:t>
-        </w:r>
-      </w:hyperlink>
-      <w:r>
-        <w:rPr>
-          <w:lang w:val="es-AR"/>
-        </w:rPr>
-        <w:t>.</w:t>
-      </w:r>
     </w:p>
     <w:p>
       <w:pPr>
@@ -406,22 +358,13 @@
         <w:rPr>
           <w:lang w:val="es-AR"/>
         </w:rPr>
-        <w:t xml:space="preserve">lar </w:t>
-      </w:r>
-      <w:hyperlink r:id="rId7" w:history="1">
-        <w:r>
-          <w:rPr>
-            <w:rStyle w:val="Hipervnculo"/>
-            <w:lang w:val="es-AR"/>
-          </w:rPr>
-          <w:t>accediendo aqui</w:t>
-        </w:r>
-      </w:hyperlink>
-      <w:r>
-        <w:rPr>
-          <w:lang w:val="es-AR"/>
-        </w:rPr>
-        <w:t>..</w:t>
+        <w:t>lar</w:t>
+      </w:r>
+      <w:r>
+        <w:rPr>
+          <w:lang w:val="es-AR"/>
+        </w:rPr>
+        <w:t>.</w:t>
       </w:r>
     </w:p>
     <w:p>
@@ -538,8 +481,262 @@
     </w:p>
     <w:p>
       <w:pPr>
+        <w:pStyle w:val="Ttulo2"/>
+      </w:pPr>
+      <w:r>
+        <w:t>3. Matriz comparativa de instalación</w:t>
+      </w:r>
+    </w:p>
+    <w:tbl>
+      <w:tblPr>
+        <w:tblStyle w:val="Sombreadoclaro-nfasis1"/>
+        <w:tblW w:w="0" w:type="auto"/>
+        <w:tblInd w:w="0" w:type="dxa"/>
+        <w:tblLook w:val="04A0" w:firstRow="1" w:lastRow="0" w:firstColumn="1" w:lastColumn="0" w:noHBand="0" w:noVBand="1"/>
+      </w:tblPr>
+      <w:tblGrid>
+        <w:gridCol w:w="2837"/>
+        <w:gridCol w:w="2838"/>
+        <w:gridCol w:w="2829"/>
+      </w:tblGrid>
+      <w:tr>
+        <w:trPr>
+          <w:cnfStyle w:val="100000000000" w:firstRow="1" w:lastRow="0" w:firstColumn="0" w:lastColumn="0" w:oddVBand="0" w:evenVBand="0" w:oddHBand="0" w:evenHBand="0" w:firstRowFirstColumn="0" w:firstRowLastColumn="0" w:lastRowFirstColumn="0" w:lastRowLastColumn="0"/>
+        </w:trPr>
+        <w:tc>
+          <w:tcPr>
+            <w:cnfStyle w:val="001000000000" w:firstRow="0" w:lastRow="0" w:firstColumn="1" w:lastColumn="0" w:oddVBand="0" w:evenVBand="0" w:oddHBand="0" w:evenHBand="0" w:firstRowFirstColumn="0" w:firstRowLastColumn="0" w:lastRowFirstColumn="0" w:lastRowLastColumn="0"/>
+            <w:tcW w:w="3120" w:type="dxa"/>
+            <w:hideMark/>
+          </w:tcPr>
+          <w:p>
+            <w:r>
+              <w:t>Criterio</w:t>
+            </w:r>
+          </w:p>
+        </w:tc>
+        <w:tc>
+          <w:tcPr>
+            <w:tcW w:w="3120" w:type="dxa"/>
+            <w:hideMark/>
+          </w:tcPr>
+          <w:p>
+            <w:pPr>
+              <w:cnfStyle w:val="100000000000" w:firstRow="1" w:lastRow="0" w:firstColumn="0" w:lastColumn="0" w:oddVBand="0" w:evenVBand="0" w:oddHBand="0" w:evenHBand="0" w:firstRowFirstColumn="0" w:firstRowLastColumn="0" w:lastRowFirstColumn="0" w:lastRowLastColumn="0"/>
+            </w:pPr>
+            <w:r>
+              <w:t>Apple iOS (Safari)</w:t>
+            </w:r>
+          </w:p>
+        </w:tc>
+        <w:tc>
+          <w:tcPr>
+            <w:tcW w:w="3120" w:type="dxa"/>
+            <w:hideMark/>
+          </w:tcPr>
+          <w:p>
+            <w:pPr>
+              <w:cnfStyle w:val="100000000000" w:firstRow="1" w:lastRow="0" w:firstColumn="0" w:lastColumn="0" w:oddVBand="0" w:evenVBand="0" w:oddHBand="0" w:evenHBand="0" w:firstRowFirstColumn="0" w:firstRowLastColumn="0" w:lastRowFirstColumn="0" w:lastRowLastColumn="0"/>
+            </w:pPr>
+            <w:r>
+              <w:t>Google Android (Chrome)</w:t>
+            </w:r>
+          </w:p>
+        </w:tc>
+      </w:tr>
+      <w:tr>
+        <w:trPr>
+          <w:cnfStyle w:val="000000100000" w:firstRow="0" w:lastRow="0" w:firstColumn="0" w:lastColumn="0" w:oddVBand="0" w:evenVBand="0" w:oddHBand="1" w:evenHBand="0" w:firstRowFirstColumn="0" w:firstRowLastColumn="0" w:lastRowFirstColumn="0" w:lastRowLastColumn="0"/>
+        </w:trPr>
+        <w:tc>
+          <w:tcPr>
+            <w:cnfStyle w:val="001000000000" w:firstRow="0" w:lastRow="0" w:firstColumn="1" w:lastColumn="0" w:oddVBand="0" w:evenVBand="0" w:oddHBand="0" w:evenHBand="0" w:firstRowFirstColumn="0" w:firstRowLastColumn="0" w:lastRowFirstColumn="0" w:lastRowLastColumn="0"/>
+            <w:tcW w:w="3120" w:type="dxa"/>
+            <w:tcBorders>
+              <w:top w:val="nil"/>
+              <w:bottom w:val="nil"/>
+            </w:tcBorders>
+            <w:hideMark/>
+          </w:tcPr>
+          <w:p>
+            <w:r>
+              <w:t>Navegador</w:t>
+            </w:r>
+          </w:p>
+        </w:tc>
+        <w:tc>
+          <w:tcPr>
+            <w:tcW w:w="3120" w:type="dxa"/>
+            <w:tcBorders>
+              <w:top w:val="nil"/>
+              <w:bottom w:val="nil"/>
+            </w:tcBorders>
+            <w:hideMark/>
+          </w:tcPr>
+          <w:p>
+            <w:pPr>
+              <w:cnfStyle w:val="000000100000" w:firstRow="0" w:lastRow="0" w:firstColumn="0" w:lastColumn="0" w:oddVBand="0" w:evenVBand="0" w:oddHBand="1" w:evenHBand="0" w:firstRowFirstColumn="0" w:firstRowLastColumn="0" w:lastRowFirstColumn="0" w:lastRowLastColumn="0"/>
+            </w:pPr>
+            <w:r>
+              <w:t>Safari Obligatorio</w:t>
+            </w:r>
+          </w:p>
+        </w:tc>
+        <w:tc>
+          <w:tcPr>
+            <w:tcW w:w="3120" w:type="dxa"/>
+            <w:tcBorders>
+              <w:top w:val="nil"/>
+              <w:bottom w:val="nil"/>
+            </w:tcBorders>
+            <w:hideMark/>
+          </w:tcPr>
+          <w:p>
+            <w:pPr>
+              <w:cnfStyle w:val="000000100000" w:firstRow="0" w:lastRow="0" w:firstColumn="0" w:lastColumn="0" w:oddVBand="0" w:evenVBand="0" w:oddHBand="1" w:evenHBand="0" w:firstRowFirstColumn="0" w:firstRowLastColumn="0" w:lastRowFirstColumn="0" w:lastRowLastColumn="0"/>
+            </w:pPr>
+            <w:r>
+              <w:t>Google Chrome / Chromium</w:t>
+            </w:r>
+          </w:p>
+        </w:tc>
+      </w:tr>
+      <w:tr>
+        <w:tc>
+          <w:tcPr>
+            <w:cnfStyle w:val="001000000000" w:firstRow="0" w:lastRow="0" w:firstColumn="1" w:lastColumn="0" w:oddVBand="0" w:evenVBand="0" w:oddHBand="0" w:evenHBand="0" w:firstRowFirstColumn="0" w:firstRowLastColumn="0" w:lastRowFirstColumn="0" w:lastRowLastColumn="0"/>
+            <w:tcW w:w="3120" w:type="dxa"/>
+            <w:tcBorders>
+              <w:top w:val="nil"/>
+              <w:left w:val="nil"/>
+              <w:bottom w:val="nil"/>
+              <w:right w:val="nil"/>
+            </w:tcBorders>
+            <w:hideMark/>
+          </w:tcPr>
+          <w:p>
+            <w:r>
+              <w:t>Ruta de comando</w:t>
+            </w:r>
+          </w:p>
+        </w:tc>
+        <w:tc>
+          <w:tcPr>
+            <w:tcW w:w="3120" w:type="dxa"/>
+            <w:tcBorders>
+              <w:top w:val="nil"/>
+              <w:left w:val="nil"/>
+              <w:bottom w:val="nil"/>
+              <w:right w:val="nil"/>
+            </w:tcBorders>
+            <w:hideMark/>
+          </w:tcPr>
+          <w:p>
+            <w:pPr>
+              <w:cnfStyle w:val="000000000000" w:firstRow="0" w:lastRow="0" w:firstColumn="0" w:lastColumn="0" w:oddVBand="0" w:evenVBand="0" w:oddHBand="0" w:evenHBand="0" w:firstRowFirstColumn="0" w:firstRowLastColumn="0" w:lastRowFirstColumn="0" w:lastRowLastColumn="0"/>
+            </w:pPr>
+            <w:r>
+              <w:t>Compartir -&gt; Agregar al inicio</w:t>
+            </w:r>
+          </w:p>
+        </w:tc>
+        <w:tc>
+          <w:tcPr>
+            <w:tcW w:w="3120" w:type="dxa"/>
+            <w:tcBorders>
+              <w:top w:val="nil"/>
+              <w:left w:val="nil"/>
+              <w:bottom w:val="nil"/>
+              <w:right w:val="nil"/>
+            </w:tcBorders>
+            <w:hideMark/>
+          </w:tcPr>
+          <w:p>
+            <w:pPr>
+              <w:cnfStyle w:val="000000000000" w:firstRow="0" w:lastRow="0" w:firstColumn="0" w:lastColumn="0" w:oddVBand="0" w:evenVBand="0" w:oddHBand="0" w:evenHBand="0" w:firstRowFirstColumn="0" w:firstRowLastColumn="0" w:lastRowFirstColumn="0" w:lastRowLastColumn="0"/>
+            </w:pPr>
+            <w:r>
+              <w:t>Menú vertical -&gt; Instalar app</w:t>
+            </w:r>
+          </w:p>
+        </w:tc>
+      </w:tr>
+      <w:tr>
+        <w:trPr>
+          <w:cnfStyle w:val="000000100000" w:firstRow="0" w:lastRow="0" w:firstColumn="0" w:lastColumn="0" w:oddVBand="0" w:evenVBand="0" w:oddHBand="1" w:evenHBand="0" w:firstRowFirstColumn="0" w:firstRowLastColumn="0" w:lastRowFirstColumn="0" w:lastRowLastColumn="0"/>
+        </w:trPr>
+        <w:tc>
+          <w:tcPr>
+            <w:cnfStyle w:val="001000000000" w:firstRow="0" w:lastRow="0" w:firstColumn="1" w:lastColumn="0" w:oddVBand="0" w:evenVBand="0" w:oddHBand="0" w:evenHBand="0" w:firstRowFirstColumn="0" w:firstRowLastColumn="0" w:lastRowFirstColumn="0" w:lastRowLastColumn="0"/>
+            <w:tcW w:w="3120" w:type="dxa"/>
+            <w:tcBorders>
+              <w:top w:val="nil"/>
+              <w:bottom w:val="single" w:sz="8" w:space="0" w:color="4472C4" w:themeColor="accent1"/>
+            </w:tcBorders>
+            <w:hideMark/>
+          </w:tcPr>
+          <w:p>
+            <w:r>
+              <w:t>Resultado</w:t>
+            </w:r>
+          </w:p>
+        </w:tc>
+        <w:tc>
+          <w:tcPr>
+            <w:tcW w:w="3120" w:type="dxa"/>
+            <w:tcBorders>
+              <w:top w:val="nil"/>
+              <w:bottom w:val="single" w:sz="8" w:space="0" w:color="4472C4" w:themeColor="accent1"/>
+            </w:tcBorders>
+            <w:hideMark/>
+          </w:tcPr>
+          <w:p>
+            <w:pPr>
+              <w:cnfStyle w:val="000000100000" w:firstRow="0" w:lastRow="0" w:firstColumn="0" w:lastColumn="0" w:oddVBand="0" w:evenVBand="0" w:oddHBand="1" w:evenHBand="0" w:firstRowFirstColumn="0" w:firstRowLastColumn="0" w:lastRowFirstColumn="0" w:lastRowLastColumn="0"/>
+              <w:rPr>
+                <w:lang w:val="es-AR"/>
+              </w:rPr>
+            </w:pPr>
+            <w:r>
+              <w:rPr>
+                <w:lang w:val="es-AR"/>
+              </w:rPr>
+              <w:t>Acceso directo en pantalla de inicio</w:t>
+            </w:r>
+          </w:p>
+        </w:tc>
+        <w:tc>
+          <w:tcPr>
+            <w:tcW w:w="3120" w:type="dxa"/>
+            <w:tcBorders>
+              <w:top w:val="nil"/>
+              <w:bottom w:val="single" w:sz="8" w:space="0" w:color="4472C4" w:themeColor="accent1"/>
+            </w:tcBorders>
+            <w:hideMark/>
+          </w:tcPr>
+          <w:p>
+            <w:pPr>
+              <w:cnfStyle w:val="000000100000" w:firstRow="0" w:lastRow="0" w:firstColumn="0" w:lastColumn="0" w:oddVBand="0" w:evenVBand="0" w:oddHBand="1" w:evenHBand="0" w:firstRowFirstColumn="0" w:firstRowLastColumn="0" w:lastRowFirstColumn="0" w:lastRowLastColumn="0"/>
+              <w:rPr>
+                <w:lang w:val="es-AR"/>
+              </w:rPr>
+            </w:pPr>
+            <w:r>
+              <w:rPr>
+                <w:lang w:val="es-AR"/>
+              </w:rPr>
+              <w:t>Ícono nativo en box general y escritorio</w:t>
+            </w:r>
+          </w:p>
+        </w:tc>
+      </w:tr>
+    </w:tbl>
+    <w:p>
+      <w:pPr>
         <w:ind w:left="720"/>
         <w:rPr>
+          <w:b/>
+          <w:bCs/>
           <w:lang w:val="es-AR"/>
         </w:rPr>
       </w:pPr>
@@ -550,6 +747,12 @@
           <w:lang w:val="es-AR"/>
         </w:rPr>
       </w:pPr>
+      <w:r>
+        <w:rPr>
+          <w:lang w:val="es-AR"/>
+        </w:rPr>
+        <w:t>G</w:t>
+      </w:r>
     </w:p>
     <w:sectPr>
       <w:pgSz w:w="11906" w:h="16838"/>
@@ -1405,6 +1608,7 @@
   <w:style w:type="character" w:default="1" w:styleId="Fuentedeprrafopredeter">
     <w:name w:val="Default Paragraph Font"/>
     <w:uiPriority w:val="1"/>
+    <w:semiHidden/>
     <w:unhideWhenUsed/>
   </w:style>
   <w:style w:type="table" w:default="1" w:styleId="Tablanormal">
@@ -1753,6 +1957,109 @@
       <w:color w:val="605E5C"/>
       <w:shd w:val="clear" w:color="auto" w:fill="E1DFDD"/>
     </w:rPr>
+  </w:style>
+  <w:style w:type="table" w:styleId="Sombreadoclaro-nfasis1">
+    <w:name w:val="Light Shading Accent 1"/>
+    <w:basedOn w:val="Tablanormal"/>
+    <w:uiPriority w:val="60"/>
+    <w:semiHidden/>
+    <w:unhideWhenUsed/>
+    <w:rsid w:val="00D45489"/>
+    <w:pPr>
+      <w:spacing w:after="0" w:line="240" w:lineRule="auto"/>
+    </w:pPr>
+    <w:rPr>
+      <w:rFonts w:eastAsiaTheme="minorEastAsia"/>
+      <w:color w:val="2F5496" w:themeColor="accent1" w:themeShade="BF"/>
+      <w:kern w:val="0"/>
+      <w:lang w:val="en-US"/>
+      <w14:ligatures w14:val="none"/>
+    </w:rPr>
+    <w:tblPr>
+      <w:tblStyleRowBandSize w:val="1"/>
+      <w:tblStyleColBandSize w:val="1"/>
+      <w:tblInd w:w="0" w:type="nil"/>
+      <w:tblBorders>
+        <w:top w:val="single" w:sz="8" w:space="0" w:color="4472C4" w:themeColor="accent1"/>
+        <w:bottom w:val="single" w:sz="8" w:space="0" w:color="4472C4" w:themeColor="accent1"/>
+      </w:tblBorders>
+    </w:tblPr>
+    <w:tblStylePr w:type="firstRow">
+      <w:pPr>
+        <w:spacing w:beforeLines="0" w:before="0" w:beforeAutospacing="0" w:afterLines="0" w:after="0" w:afterAutospacing="0" w:line="240" w:lineRule="auto"/>
+      </w:pPr>
+      <w:rPr>
+        <w:b/>
+        <w:bCs/>
+      </w:rPr>
+      <w:tblPr/>
+      <w:tcPr>
+        <w:tcBorders>
+          <w:top w:val="single" w:sz="8" w:space="0" w:color="4472C4" w:themeColor="accent1"/>
+          <w:left w:val="nil"/>
+          <w:bottom w:val="single" w:sz="8" w:space="0" w:color="4472C4" w:themeColor="accent1"/>
+          <w:right w:val="nil"/>
+          <w:insideH w:val="nil"/>
+          <w:insideV w:val="nil"/>
+        </w:tcBorders>
+      </w:tcPr>
+    </w:tblStylePr>
+    <w:tblStylePr w:type="lastRow">
+      <w:pPr>
+        <w:spacing w:beforeLines="0" w:before="0" w:beforeAutospacing="0" w:afterLines="0" w:after="0" w:afterAutospacing="0" w:line="240" w:lineRule="auto"/>
+      </w:pPr>
+      <w:rPr>
+        <w:b/>
+        <w:bCs/>
+      </w:rPr>
+      <w:tblPr/>
+      <w:tcPr>
+        <w:tcBorders>
+          <w:top w:val="single" w:sz="8" w:space="0" w:color="4472C4" w:themeColor="accent1"/>
+          <w:left w:val="nil"/>
+          <w:bottom w:val="single" w:sz="8" w:space="0" w:color="4472C4" w:themeColor="accent1"/>
+          <w:right w:val="nil"/>
+          <w:insideH w:val="nil"/>
+          <w:insideV w:val="nil"/>
+        </w:tcBorders>
+      </w:tcPr>
+    </w:tblStylePr>
+    <w:tblStylePr w:type="firstCol">
+      <w:rPr>
+        <w:b/>
+        <w:bCs/>
+      </w:rPr>
+    </w:tblStylePr>
+    <w:tblStylePr w:type="lastCol">
+      <w:rPr>
+        <w:b/>
+        <w:bCs/>
+      </w:rPr>
+    </w:tblStylePr>
+    <w:tblStylePr w:type="band1Vert">
+      <w:tblPr/>
+      <w:tcPr>
+        <w:tcBorders>
+          <w:left w:val="nil"/>
+          <w:right w:val="nil"/>
+          <w:insideH w:val="nil"/>
+          <w:insideV w:val="nil"/>
+        </w:tcBorders>
+        <w:shd w:val="clear" w:color="auto" w:fill="D0DBF0" w:themeFill="accent1" w:themeFillTint="3F"/>
+      </w:tcPr>
+    </w:tblStylePr>
+    <w:tblStylePr w:type="band1Horz">
+      <w:tblPr/>
+      <w:tcPr>
+        <w:tcBorders>
+          <w:left w:val="nil"/>
+          <w:right w:val="nil"/>
+          <w:insideH w:val="nil"/>
+          <w:insideV w:val="nil"/>
+        </w:tcBorders>
+        <w:shd w:val="clear" w:color="auto" w:fill="D0DBF0" w:themeFill="accent1" w:themeFillTint="3F"/>
+      </w:tcPr>
+    </w:tblStylePr>
   </w:style>
 </w:styles>
 </file>

</xml_diff>